<commit_message>
Add V2 expanded manuscript and evidence-preserving comparison
</commit_message>
<xml_diff>
--- a/paper_template/长春工程学院学报(自然科学版)/自适应多尺度加权的多变量网络流量预测_ccgcxyxbV2_扩充稿.docx
+++ b/paper_template/长春工程学院学报(自然科学版)/自适应多尺度加权的多变量网络流量预测_ccgcxyxbV2_扩充稿.docx
@@ -570,7 +570,7 @@
         <w:keepNext w:val="0"/>
       </w:pPr>
       <w:r>
-        <w:t>从预测任务来看，OD流量矩阵以源节点和目的节点的组合为变量，记录了各节点对之间随时间变化的通信需求。与只考察全网总流量不同，多变量预测需要在同一时间窗口内同时给出多个OD变量的未来轨迹。本文不在预测阶段显式建立节点拓扑关系，而是将计算重点放在各变量共享的时间变化模式上，使模型能够在较多OD变量的条件下保持相对简洁的参数结构。</w:t>
+        <w:t>从预测任务来看，OD流量矩阵以源节点和目的节点的组合为变量，记录了各节点对之间随时间变化的通信需求。与只考察全网总流量不同，多变量预测需要在同一时间窗口内同时给出多个OD变量的未来轨迹。本文围绕各变量共享的时间变化模式展开预测，通过共享时间映射参数控制模型规模，使其能够在较多OD变量的条件下保持简洁结构，并为窗口级尺度融合提供一致的候选预测。</w:t>
       </w:r>
     </w:p>
     <w:p>
@@ -5629,7 +5629,7 @@
         <w:rPr>
           <w:i/>
         </w:rPr>
-        <w:t>与直接把全部OD时间序列输入另一套预测网络不同，路由分支仅接收四个由当前窗口计算得到的统计量。这些量依次从整体位置、离散程度、末端状态和相邻时刻变化四个方面描述窗口，但不对某个单独OD变量生成专属权重。Softmax将三个尺度分数归一化，使最终输出保持为各专家候选预测的加权组合。对于不同历史窗口，专家网络保持不变，融合系数则由各自窗口的特征确定。</w:t>
+        <w:t>与直接把全部OD时间序列输入另一套预测网络不同，路由分支仅接收四个由当前窗口计算得到的统计量。这些量依次从整体位置、离散程度、末端状态和相邻时刻变化四个方面描述窗口。Softmax将三个尺度分数归一化，使最终输出保持为各专家候选预测的加权组合。同一个窗口的融合权重在全部OD变量与预测步上共享；当输入窗口改变时，专家参数保持不变，融合系数根据新窗口的统计特征相应调整。</w:t>
       </w:r>
     </w:p>
     <w:p>
@@ -9276,7 +9276,7 @@
         <w:keepNext w:val="0"/>
       </w:pPr>
       <w:r>
-        <w:t>与单尺度DLinear相比，本文方法通过另外两个聚合尺度提供补充候选预测；与LightTS相比，主要差别在于以三个分解线性专家和低维路由完成任务，而非采用外部基线的网络结构。表2和图2将绝对误差、逐种子配对降幅及参数数量分别呈现，可以同时观察预测结果和模型规模。需要指出，参数比例以相应数据集上的LightTS配置为分母，并非声称本文方法是所有对照中参数最少的模型。</w:t>
+        <w:t>与单尺度DLinear相比，本文方法通过另外两个聚合尺度提供补充候选预测；与LightTS相比，本文方法以三个分解线性专家和低维路由完成预测任务，保持了简洁的计算结构。表2和图2分别呈现绝对误差、逐种子配对降幅及模型参数数量，既能查看具体预测误差，也能比较不同网络结构的规模。相对LightTS的参数比例按照相应数据集的模型配置分别计算，便于结合两项误差指标评估本方法在任务中的精度与参数规模。</w:t>
       </w:r>
     </w:p>
     <w:p>

</xml_diff>

<commit_message>
Finalize ccgcxyxb V2 with 1613-character expansion, regular Songti body styling and QA report
</commit_message>
<xml_diff>
--- a/paper_template/长春工程学院学报(自然科学版)/自适应多尺度加权的多变量网络流量预测_ccgcxyxbV2_扩充稿.docx
+++ b/paper_template/长春工程学院学报(自然科学版)/自适应多尺度加权的多变量网络流量预测_ccgcxyxbV2_扩充稿.docx
@@ -570,7 +570,7 @@
         <w:keepNext w:val="0"/>
       </w:pPr>
       <w:r>
-        <w:t>从预测任务来看，OD流量矩阵以源节点和目的节点的组合为变量，记录了各节点对之间随时间变化的通信需求。与只考察全网总流量不同，多变量预测需要在同一时间窗口内同时给出多个OD变量的未来轨迹。本文不在预测阶段显式建立节点拓扑关系，而是将计算重点放在各变量共享的时间变化模式上，使模型能够在较多OD变量的条件下保持相对简洁的参数结构。</w:t>
+        <w:t>从预测任务来看，OD流量矩阵以源节点和目的节点的组合为变量，记录了各节点对之间随时间变化的通信需求。与只考察全网总流量不同，多变量预测需要在同一时间窗口内同时给出多个OD变量的未来轨迹。本文围绕各变量共享的时间变化模式展开预测，通过共享时间映射参数控制模型规模，使其能够在较多OD变量的条件下保持简洁结构，并为窗口级尺度融合提供一致的候选预测。</w:t>
       </w:r>
     </w:p>
     <w:p>
@@ -1845,9 +1845,6 @@
         <w:keepNext w:val="0"/>
       </w:pPr>
       <w:r>
-        <w:rPr>
-          <w:i/>
-        </w:rPr>
         <w:t>上述处理同时服务于模型训练和结果比较。时间顺序划分保证验证集、测试集位于训练阶段之后；标准化参数只由训练部分确定，避免后续时间段的信息参与预处理参数估计。每个OD变量分别进行变换与标准化，可以减小不同流量量级对损失计算的影响。构造样本时，输入窗口和预测目标均限制在各自数据子集内，因而同一数据划分能够供DLinear、LightTS及各融合模型使用。</w:t>
       </w:r>
     </w:p>
@@ -3465,10 +3462,6 @@
         <w:keepNext w:val="0"/>
       </w:pPr>
       <w:r>
-        <w:rPr>
-          <w:b/>
-          <w:i/>
-        </w:rPr>
         <w:t>三个尺度并非对应三个不同的预测时段，而是在同一段历史上形成粒度不同的输入表示。细粒度分支直接保留逐小时观测，较粗粒度分支通过局部平均削弱相邻小时之间的短时起伏；各分支随后独立完成趋势项和余项的线性映射。这样设置的目的，是使候选预测来自不同时间分辨率，同时保持输出维度一致。尺度数和专家结构在全部融合消融模型中保持不变，有利于单独考察权重分配方式的作用。</w:t>
       </w:r>
     </w:p>
@@ -5626,10 +5619,7 @@
         <w:keepNext w:val="0"/>
       </w:pPr>
       <w:r>
-        <w:rPr>
-          <w:i/>
-        </w:rPr>
-        <w:t>与直接把全部OD时间序列输入另一套预测网络不同，路由分支仅接收四个由当前窗口计算得到的统计量。这些量依次从整体位置、离散程度、末端状态和相邻时刻变化四个方面描述窗口，但不对某个单独OD变量生成专属权重。Softmax将三个尺度分数归一化，使最终输出保持为各专家候选预测的加权组合。对于不同历史窗口，专家网络保持不变，融合系数则由各自窗口的特征确定。</w:t>
+        <w:t>与直接把全部OD时间序列输入另一套预测网络不同，路由分支仅接收四个由当前窗口计算得到的统计量。这些量依次从整体位置、离散程度、末端状态和相邻时刻变化四个方面描述窗口。Softmax将三个尺度分数归一化，使最终输出保持为各专家候选预测的加权组合。同一个窗口的融合权重在全部OD变量与预测步上共享；当输入窗口改变时，专家参数保持不变，融合系数根据新窗口的统计特征相应调整。</w:t>
       </w:r>
     </w:p>
     <w:p>
@@ -7782,9 +7772,6 @@
         <w:keepNext w:val="0"/>
       </w:pPr>
       <w:r>
-        <w:rPr>
-          <w:i/>
-        </w:rPr>
         <w:t>基线与本文方法使用相同数据集、时间划分、输入窗口和预测目标，所有模型均在各自验证集上选择检查点，再使用测试集评价。随机种子42～49用于重复训练，并按种子保留预测记录和误差指标。表中“均值±标准差”反映不同初始化下的描述性变化；相对降幅先在同一种子内配对计算，再对八次结果取平均，以避免将两个模型的非配对汇总值直接作为单次改善比例。</w:t>
       </w:r>
     </w:p>
@@ -9276,7 +9263,7 @@
         <w:keepNext w:val="0"/>
       </w:pPr>
       <w:r>
-        <w:t>与单尺度DLinear相比，本文方法通过另外两个聚合尺度提供补充候选预测；与LightTS相比，主要差别在于以三个分解线性专家和低维路由完成任务，而非采用外部基线的网络结构。表2和图2将绝对误差、逐种子配对降幅及参数数量分别呈现，可以同时观察预测结果和模型规模。需要指出，参数比例以相应数据集上的LightTS配置为分母，并非声称本文方法是所有对照中参数最少的模型。</w:t>
+        <w:t>与单尺度DLinear相比，本文方法通过另外两个聚合尺度提供补充候选预测；与LightTS相比，本文方法以三个分解线性专家和低维路由完成预测任务，保持了简洁的计算结构。表2和图2分别呈现绝对误差、逐种子配对降幅及模型参数数量，既能查看具体预测误差，也能比较不同网络结构的规模。相对LightTS的参数比例按照相应数据集的模型配置分别计算，便于结合两项误差指标评估本方法在任务中的精度与参数规模。</w:t>
       </w:r>
     </w:p>
     <w:p>

</xml_diff>